<commit_message>
separate platform owner email
</commit_message>
<xml_diff>
--- a/промт.docx
+++ b/промт.docx
@@ -9,12 +9,12 @@
         <w:tblLook w:val="04A0" w:firstRow="1" w:lastRow="0" w:firstColumn="1" w:lastColumn="0" w:noHBand="0" w:noVBand="1"/>
       </w:tblPr>
       <w:tblGrid>
-        <w:gridCol w:w="6627"/>
-        <w:gridCol w:w="1505"/>
-        <w:gridCol w:w="221"/>
-        <w:gridCol w:w="221"/>
-        <w:gridCol w:w="221"/>
-        <w:gridCol w:w="221"/>
+        <w:gridCol w:w="5508"/>
+        <w:gridCol w:w="1280"/>
+        <w:gridCol w:w="1568"/>
+        <w:gridCol w:w="220"/>
+        <w:gridCol w:w="220"/>
+        <w:gridCol w:w="220"/>
       </w:tblGrid>
       <w:tr>
         <w:tc>
@@ -419,7 +419,7 @@
                 <w:lang w:val="en-IL"/>
               </w:rPr>
               <w:pict w14:anchorId="54815C71">
-                <v:rect id="_x0000_i1957" style="width:0;height:1.5pt" o:hralign="center" o:hrstd="t" o:hr="t" fillcolor="#a0a0a0" stroked="f"/>
+                <v:rect id="_x0000_i2149" style="width:0;height:1.5pt" o:hralign="center" o:hrstd="t" o:hr="t" fillcolor="#a0a0a0" stroked="f"/>
               </w:pict>
             </w:r>
           </w:p>
@@ -610,7 +610,7 @@
                 <w:lang w:val="en-IL"/>
               </w:rPr>
               <w:pict w14:anchorId="01C43C9D">
-                <v:rect id="_x0000_i1958" style="width:0;height:1.5pt" o:hralign="center" o:hrstd="t" o:hr="t" fillcolor="#a0a0a0" stroked="f"/>
+                <v:rect id="_x0000_i2150" style="width:0;height:1.5pt" o:hralign="center" o:hrstd="t" o:hr="t" fillcolor="#a0a0a0" stroked="f"/>
               </w:pict>
             </w:r>
           </w:p>
@@ -731,7 +731,7 @@
                 <w:lang w:val="en-IL"/>
               </w:rPr>
               <w:pict w14:anchorId="6055F32E">
-                <v:rect id="_x0000_i1959" style="width:0;height:1.5pt" o:hralign="center" o:hrstd="t" o:hr="t" fillcolor="#a0a0a0" stroked="f"/>
+                <v:rect id="_x0000_i2151" style="width:0;height:1.5pt" o:hralign="center" o:hrstd="t" o:hr="t" fillcolor="#a0a0a0" stroked="f"/>
               </w:pict>
             </w:r>
           </w:p>
@@ -895,7 +895,7 @@
                 <w:lang w:val="en-IL"/>
               </w:rPr>
               <w:pict w14:anchorId="5C5F02A1">
-                <v:rect id="_x0000_i1960" style="width:0;height:1.5pt" o:hralign="center" o:hrstd="t" o:hr="t" fillcolor="#a0a0a0" stroked="f"/>
+                <v:rect id="_x0000_i2152" style="width:0;height:1.5pt" o:hralign="center" o:hrstd="t" o:hr="t" fillcolor="#a0a0a0" stroked="f"/>
               </w:pict>
             </w:r>
           </w:p>
@@ -9193,25 +9193,191 @@
         </w:tc>
         <w:tc>
           <w:tcPr>
-            <w:tcW w:w="1418" w:type="dxa"/>
+            <w:tcW w:w="3544" w:type="dxa"/>
           </w:tcPr>
+          <w:p>
+            <w:pPr>
+              <w:rPr>
+                <w:b/>
+                <w:bCs/>
+                <w:lang w:val="en-IL"/>
+              </w:rPr>
+            </w:pPr>
+            <w:r>
+              <w:rPr>
+                <w:rFonts w:ascii="Segoe UI Emoji" w:hAnsi="Segoe UI Emoji" w:cs="Segoe UI Emoji"/>
+                <w:b/>
+                <w:bCs/>
+                <w:lang w:val="en-IL"/>
+              </w:rPr>
+              <w:t>🔌</w:t>
+            </w:r>
+            <w:r>
+              <w:rPr>
+                <w:b/>
+                <w:bCs/>
+                <w:lang w:val="en-IL"/>
+              </w:rPr>
+              <w:t xml:space="preserve"> ЧТО НУЖНО ПОДКЛЮЧИТЬ</w:t>
+            </w:r>
+          </w:p>
+          <w:p>
+            <w:pPr>
+              <w:rPr>
+                <w:b/>
+                <w:bCs/>
+                <w:lang w:val="en-IL"/>
+              </w:rPr>
+            </w:pPr>
+            <w:r>
+              <w:rPr>
+                <w:b/>
+                <w:bCs/>
+                <w:lang w:val="en-IL"/>
+              </w:rPr>
+              <w:t>1️</w:t>
+            </w:r>
+            <w:r>
+              <w:rPr>
+                <w:rFonts w:ascii="Segoe UI Symbol" w:hAnsi="Segoe UI Symbol" w:cs="Segoe UI Symbol"/>
+                <w:b/>
+                <w:bCs/>
+                <w:lang w:val="en-IL"/>
+              </w:rPr>
+              <w:t>⃣</w:t>
+            </w:r>
+            <w:r>
+              <w:rPr>
+                <w:b/>
+                <w:bCs/>
+                <w:lang w:val="en-IL"/>
+              </w:rPr>
+              <w:t xml:space="preserve"> SMS </w:t>
+            </w:r>
+            <w:proofErr w:type="spellStart"/>
+            <w:r>
+              <w:rPr>
+                <w:b/>
+                <w:bCs/>
+                <w:lang w:val="en-IL"/>
+              </w:rPr>
+              <w:t>провайдер</w:t>
+            </w:r>
+            <w:proofErr w:type="spellEnd"/>
+            <w:r>
+              <w:rPr>
+                <w:b/>
+                <w:bCs/>
+                <w:lang w:val="en-IL"/>
+              </w:rPr>
+              <w:t xml:space="preserve"> (ОБЯЗАТЕЛЬНО)</w:t>
+            </w:r>
+          </w:p>
+          <w:p>
+            <w:pPr>
+              <w:rPr>
+                <w:lang w:val="en-IL"/>
+              </w:rPr>
+            </w:pPr>
+            <w:r>
+              <w:rPr>
+                <w:rFonts w:ascii="Segoe UI Emoji" w:hAnsi="Segoe UI Emoji" w:cs="Segoe UI Emoji"/>
+                <w:lang w:val="en-IL"/>
+              </w:rPr>
+              <w:t>👉</w:t>
+            </w:r>
+            <w:r>
+              <w:rPr>
+                <w:lang w:val="en-IL"/>
+              </w:rPr>
+              <w:t xml:space="preserve"> </w:t>
+            </w:r>
+            <w:proofErr w:type="spellStart"/>
+            <w:r>
+              <w:rPr>
+                <w:lang w:val="en-IL"/>
+              </w:rPr>
+              <w:t>самый</w:t>
+            </w:r>
+            <w:proofErr w:type="spellEnd"/>
+            <w:r>
+              <w:rPr>
+                <w:lang w:val="en-IL"/>
+              </w:rPr>
+              <w:t xml:space="preserve"> </w:t>
+            </w:r>
+            <w:proofErr w:type="spellStart"/>
+            <w:r>
+              <w:rPr>
+                <w:lang w:val="en-IL"/>
+              </w:rPr>
+              <w:t>простой</w:t>
+            </w:r>
+            <w:proofErr w:type="spellEnd"/>
+            <w:r>
+              <w:rPr>
+                <w:lang w:val="en-IL"/>
+              </w:rPr>
+              <w:t xml:space="preserve"> и </w:t>
+            </w:r>
+            <w:proofErr w:type="spellStart"/>
+            <w:r>
+              <w:rPr>
+                <w:lang w:val="en-IL"/>
+              </w:rPr>
+              <w:t>правильный</w:t>
+            </w:r>
+            <w:proofErr w:type="spellEnd"/>
+            <w:r>
+              <w:rPr>
+                <w:lang w:val="en-IL"/>
+              </w:rPr>
+              <w:t>:</w:t>
+            </w:r>
+          </w:p>
+          <w:p>
+            <w:pPr>
+              <w:rPr>
+                <w:b/>
+                <w:bCs/>
+                <w:lang w:val="en-IL"/>
+              </w:rPr>
+            </w:pPr>
+            <w:r>
+              <w:rPr>
+                <w:rFonts w:ascii="Segoe UI Emoji" w:hAnsi="Segoe UI Emoji" w:cs="Segoe UI Emoji"/>
+                <w:b/>
+                <w:bCs/>
+                <w:lang w:val="en-IL"/>
+              </w:rPr>
+              <w:t>👉</w:t>
+            </w:r>
+            <w:r>
+              <w:rPr>
+                <w:b/>
+                <w:bCs/>
+                <w:lang w:val="en-IL"/>
+              </w:rPr>
+              <w:t xml:space="preserve"> Twilio</w:t>
+            </w:r>
+          </w:p>
           <w:p/>
         </w:tc>
         <w:tc>
           <w:tcPr>
-            <w:tcW w:w="1843" w:type="dxa"/>
-          </w:tcPr>
-          <w:p/>
-        </w:tc>
-        <w:tc>
-          <w:tcPr>
-            <w:tcW w:w="2409" w:type="dxa"/>
+            <w:tcW w:w="2410" w:type="dxa"/>
           </w:tcPr>
           <w:p/>
         </w:tc>
         <w:tc>
           <w:tcPr>
             <w:tcW w:w="2410" w:type="dxa"/>
+          </w:tcPr>
+          <w:p/>
+        </w:tc>
+        <w:tc>
+          <w:tcPr>
+            <w:tcW w:w="335" w:type="dxa"/>
           </w:tcPr>
           <w:p/>
         </w:tc>

</xml_diff>

<commit_message>
fix docflow invite re-login session issue
</commit_message>
<xml_diff>
--- a/промт.docx
+++ b/промт.docx
@@ -9,12 +9,12 @@
         <w:tblLook w:val="04A0" w:firstRow="1" w:lastRow="0" w:firstColumn="1" w:lastColumn="0" w:noHBand="0" w:noVBand="1"/>
       </w:tblPr>
       <w:tblGrid>
-        <w:gridCol w:w="5508"/>
-        <w:gridCol w:w="1280"/>
-        <w:gridCol w:w="1568"/>
-        <w:gridCol w:w="220"/>
-        <w:gridCol w:w="220"/>
-        <w:gridCol w:w="220"/>
+        <w:gridCol w:w="4071"/>
+        <w:gridCol w:w="990"/>
+        <w:gridCol w:w="1201"/>
+        <w:gridCol w:w="2316"/>
+        <w:gridCol w:w="219"/>
+        <w:gridCol w:w="219"/>
       </w:tblGrid>
       <w:tr>
         <w:tc>
@@ -419,7 +419,7 @@
                 <w:lang w:val="en-IL"/>
               </w:rPr>
               <w:pict w14:anchorId="54815C71">
-                <v:rect id="_x0000_i2149" style="width:0;height:1.5pt" o:hralign="center" o:hrstd="t" o:hr="t" fillcolor="#a0a0a0" stroked="f"/>
+                <v:rect id="_x0000_i2185" style="width:0;height:1.5pt" o:hralign="center" o:hrstd="t" o:hr="t" fillcolor="#a0a0a0" stroked="f"/>
               </w:pict>
             </w:r>
           </w:p>
@@ -610,7 +610,7 @@
                 <w:lang w:val="en-IL"/>
               </w:rPr>
               <w:pict w14:anchorId="01C43C9D">
-                <v:rect id="_x0000_i2150" style="width:0;height:1.5pt" o:hralign="center" o:hrstd="t" o:hr="t" fillcolor="#a0a0a0" stroked="f"/>
+                <v:rect id="_x0000_i2186" style="width:0;height:1.5pt" o:hralign="center" o:hrstd="t" o:hr="t" fillcolor="#a0a0a0" stroked="f"/>
               </w:pict>
             </w:r>
           </w:p>
@@ -731,7 +731,7 @@
                 <w:lang w:val="en-IL"/>
               </w:rPr>
               <w:pict w14:anchorId="6055F32E">
-                <v:rect id="_x0000_i2151" style="width:0;height:1.5pt" o:hralign="center" o:hrstd="t" o:hr="t" fillcolor="#a0a0a0" stroked="f"/>
+                <v:rect id="_x0000_i2187" style="width:0;height:1.5pt" o:hralign="center" o:hrstd="t" o:hr="t" fillcolor="#a0a0a0" stroked="f"/>
               </w:pict>
             </w:r>
           </w:p>
@@ -895,7 +895,7 @@
                 <w:lang w:val="en-IL"/>
               </w:rPr>
               <w:pict w14:anchorId="5C5F02A1">
-                <v:rect id="_x0000_i2152" style="width:0;height:1.5pt" o:hralign="center" o:hrstd="t" o:hr="t" fillcolor="#a0a0a0" stroked="f"/>
+                <v:rect id="_x0000_i2188" style="width:0;height:1.5pt" o:hralign="center" o:hrstd="t" o:hr="t" fillcolor="#a0a0a0" stroked="f"/>
               </w:pict>
             </w:r>
           </w:p>
@@ -9367,6 +9367,32 @@
           <w:tcPr>
             <w:tcW w:w="2410" w:type="dxa"/>
           </w:tcPr>
+          <w:p>
+            <w:hyperlink r:id="rId5" w:history="1">
+              <w:r>
+                <w:rPr>
+                  <w:rStyle w:val="Hyperlink"/>
+                </w:rPr>
+                <w:t>marinator.321@gmail.com</w:t>
+              </w:r>
+            </w:hyperlink>
+          </w:p>
+          <w:p>
+            <w:r>
+              <w:t>Alisa2004@@</w:t>
+            </w:r>
+          </w:p>
+          <w:p>
+            <w:hyperlink r:id="rId6" w:history="1">
+              <w:r>
+                <w:rPr>
+                  <w:rStyle w:val="Hyperlink"/>
+                </w:rPr>
+                <w:t>https://www.nodexpro.com/platform-owner/legal-control</w:t>
+              </w:r>
+            </w:hyperlink>
+          </w:p>
+          <w:p/>
           <w:p/>
         </w:tc>
         <w:tc>
@@ -14214,6 +14240,29 @@
       </w:tblBorders>
     </w:tblPr>
   </w:style>
+  <w:style w:type="character" w:styleId="Hyperlink">
+    <w:name w:val="Hyperlink"/>
+    <w:basedOn w:val="DefaultParagraphFont"/>
+    <w:uiPriority w:val="99"/>
+    <w:unhideWhenUsed/>
+    <w:rsid w:val="008D6044"/>
+    <w:rPr>
+      <w:color w:val="467886" w:themeColor="hyperlink"/>
+      <w:u w:val="single"/>
+    </w:rPr>
+  </w:style>
+  <w:style w:type="character" w:styleId="UnresolvedMention">
+    <w:name w:val="Unresolved Mention"/>
+    <w:basedOn w:val="DefaultParagraphFont"/>
+    <w:uiPriority w:val="99"/>
+    <w:semiHidden/>
+    <w:unhideWhenUsed/>
+    <w:rsid w:val="008D6044"/>
+    <w:rPr>
+      <w:color w:val="605E5C"/>
+      <w:shd w:val="clear" w:color="auto" w:fill="E1DFDD"/>
+    </w:rPr>
+  </w:style>
 </w:styles>
 </file>
 

</xml_diff>

<commit_message>
Add owner commercial controls
</commit_message>
<xml_diff>
--- a/промт.docx
+++ b/промт.docx
@@ -9,11 +9,11 @@
         <w:tblLook w:val="04A0" w:firstRow="1" w:lastRow="0" w:firstColumn="1" w:lastColumn="0" w:noHBand="0" w:noVBand="1"/>
       </w:tblPr>
       <w:tblGrid>
-        <w:gridCol w:w="3529"/>
-        <w:gridCol w:w="882"/>
-        <w:gridCol w:w="1063"/>
-        <w:gridCol w:w="2022"/>
-        <w:gridCol w:w="1301"/>
+        <w:gridCol w:w="3348"/>
+        <w:gridCol w:w="845"/>
+        <w:gridCol w:w="1440"/>
+        <w:gridCol w:w="1923"/>
+        <w:gridCol w:w="1241"/>
         <w:gridCol w:w="219"/>
       </w:tblGrid>
       <w:tr>
@@ -251,7 +251,7 @@
           <w:p>
             <w:r>
               <w:pict w14:anchorId="54815C71">
-                <v:rect id="_x0000_i2179" style="width:0;height:1.5pt" o:hralign="center" o:hrstd="t" o:hr="t" fillcolor="#a0a0a0" stroked="f"/>
+                <v:rect id="_x0000_i2838" style="width:0;height:1.5pt" o:hralign="center" o:hrstd="t" o:hr="t" fillcolor="#a0a0a0" stroked="f"/>
               </w:pict>
             </w:r>
           </w:p>
@@ -356,7 +356,7 @@
           <w:p>
             <w:r>
               <w:pict w14:anchorId="01C43C9D">
-                <v:rect id="_x0000_i2180" style="width:0;height:1.5pt" o:hralign="center" o:hrstd="t" o:hr="t" fillcolor="#a0a0a0" stroked="f"/>
+                <v:rect id="_x0000_i2839" style="width:0;height:1.5pt" o:hralign="center" o:hrstd="t" o:hr="t" fillcolor="#a0a0a0" stroked="f"/>
               </w:pict>
             </w:r>
           </w:p>
@@ -423,7 +423,7 @@
           <w:p>
             <w:r>
               <w:pict w14:anchorId="6055F32E">
-                <v:rect id="_x0000_i2181" style="width:0;height:1.5pt" o:hralign="center" o:hrstd="t" o:hr="t" fillcolor="#a0a0a0" stroked="f"/>
+                <v:rect id="_x0000_i2840" style="width:0;height:1.5pt" o:hralign="center" o:hrstd="t" o:hr="t" fillcolor="#a0a0a0" stroked="f"/>
               </w:pict>
             </w:r>
           </w:p>
@@ -523,7 +523,7 @@
           <w:p>
             <w:r>
               <w:pict w14:anchorId="5C5F02A1">
-                <v:rect id="_x0000_i2182" style="width:0;height:1.5pt" o:hralign="center" o:hrstd="t" o:hr="t" fillcolor="#a0a0a0" stroked="f"/>
+                <v:rect id="_x0000_i2841" style="width:0;height:1.5pt" o:hralign="center" o:hrstd="t" o:hr="t" fillcolor="#a0a0a0" stroked="f"/>
               </w:pict>
             </w:r>
           </w:p>
@@ -4374,7 +4374,240 @@
               <w:t xml:space="preserve"> Twilio</w:t>
             </w:r>
           </w:p>
-          <w:p/>
+          <w:p>
+            <w:pPr>
+              <w:rPr>
+                <w:lang w:val="ru-RU"/>
+              </w:rPr>
+            </w:pPr>
+          </w:p>
+          <w:p>
+            <w:pPr>
+              <w:rPr>
+                <w:lang w:val="ru-RU"/>
+              </w:rPr>
+            </w:pPr>
+          </w:p>
+          <w:p>
+            <w:pPr>
+              <w:rPr>
+                <w:lang w:val="en-IL"/>
+              </w:rPr>
+            </w:pPr>
+            <w:r>
+              <w:rPr>
+                <w:lang w:val="en-IL"/>
+              </w:rPr>
+              <w:t>Дыры:</w:t>
+            </w:r>
+          </w:p>
+          <w:p>
+            <w:pPr>
+              <w:numPr>
+                <w:ilvl w:val="0"/>
+                <w:numId w:val="77"/>
+              </w:numPr>
+              <w:rPr>
+                <w:lang w:val="en-IL"/>
+              </w:rPr>
+            </w:pPr>
+            <w:r>
+              <w:rPr>
+                <w:b/>
+                <w:bCs/>
+                <w:lang w:val="en-IL"/>
+              </w:rPr>
+              <w:t>bus factor = 1</w:t>
+            </w:r>
+            <w:r>
+              <w:rPr>
+                <w:lang w:val="en-IL"/>
+              </w:rPr>
+              <w:t xml:space="preserve"> → если твой owner login потерян/сломался, ты заблокирована. </w:t>
+            </w:r>
+          </w:p>
+          <w:p>
+            <w:pPr>
+              <w:numPr>
+                <w:ilvl w:val="0"/>
+                <w:numId w:val="77"/>
+              </w:numPr>
+              <w:rPr>
+                <w:lang w:val="en-IL"/>
+              </w:rPr>
+            </w:pPr>
+            <w:r>
+              <w:rPr>
+                <w:b/>
+                <w:bCs/>
+                <w:lang w:val="en-IL"/>
+              </w:rPr>
+              <w:t>нет RBAC для platform team</w:t>
+            </w:r>
+            <w:r>
+              <w:rPr>
+                <w:lang w:val="en-IL"/>
+              </w:rPr>
+              <w:t xml:space="preserve"> → нельзя дать доступ второму trusted admin. </w:t>
+            </w:r>
+          </w:p>
+          <w:p>
+            <w:pPr>
+              <w:numPr>
+                <w:ilvl w:val="0"/>
+                <w:numId w:val="77"/>
+              </w:numPr>
+              <w:rPr>
+                <w:lang w:val="en-IL"/>
+              </w:rPr>
+            </w:pPr>
+            <w:r>
+              <w:rPr>
+                <w:b/>
+                <w:bCs/>
+                <w:lang w:val="en-IL"/>
+              </w:rPr>
+              <w:t>опасные действия без approval</w:t>
+            </w:r>
+            <w:r>
+              <w:rPr>
+                <w:lang w:val="en-IL"/>
+              </w:rPr>
+              <w:t xml:space="preserve"> → один клик = включил бесплатный доступ всем. </w:t>
+            </w:r>
+          </w:p>
+          <w:p>
+            <w:pPr>
+              <w:numPr>
+                <w:ilvl w:val="0"/>
+                <w:numId w:val="77"/>
+              </w:numPr>
+              <w:rPr>
+                <w:lang w:val="en-IL"/>
+              </w:rPr>
+            </w:pPr>
+            <w:r>
+              <w:rPr>
+                <w:b/>
+                <w:bCs/>
+                <w:lang w:val="en-IL"/>
+              </w:rPr>
+              <w:t>нет soft limits</w:t>
+            </w:r>
+            <w:r>
+              <w:rPr>
+                <w:lang w:val="en-IL"/>
+              </w:rPr>
+              <w:t xml:space="preserve"> → owner может случайно дать вечный free access. </w:t>
+            </w:r>
+          </w:p>
+          <w:p>
+            <w:pPr>
+              <w:numPr>
+                <w:ilvl w:val="0"/>
+                <w:numId w:val="77"/>
+              </w:numPr>
+              <w:rPr>
+                <w:lang w:val="en-IL"/>
+              </w:rPr>
+            </w:pPr>
+            <w:r>
+              <w:rPr>
+                <w:b/>
+                <w:bCs/>
+                <w:lang w:val="en-IL"/>
+              </w:rPr>
+              <w:t>нет break-glass recovery</w:t>
+            </w:r>
+            <w:r>
+              <w:rPr>
+                <w:lang w:val="en-IL"/>
+              </w:rPr>
+              <w:t xml:space="preserve"> → что если owner account locked? </w:t>
+            </w:r>
+          </w:p>
+          <w:p>
+            <w:pPr>
+              <w:numPr>
+                <w:ilvl w:val="0"/>
+                <w:numId w:val="77"/>
+              </w:numPr>
+              <w:rPr>
+                <w:lang w:val="en-IL"/>
+              </w:rPr>
+            </w:pPr>
+            <w:r>
+              <w:rPr>
+                <w:b/>
+                <w:bCs/>
+                <w:lang w:val="en-IL"/>
+              </w:rPr>
+              <w:t>audit есть, но rollback нужен</w:t>
+            </w:r>
+            <w:r>
+              <w:rPr>
+                <w:lang w:val="en-IL"/>
+              </w:rPr>
+              <w:t xml:space="preserve"> → отменить ошибочное действие. </w:t>
+            </w:r>
+          </w:p>
+          <w:p>
+            <w:pPr>
+              <w:numPr>
+                <w:ilvl w:val="0"/>
+                <w:numId w:val="77"/>
+              </w:numPr>
+              <w:rPr>
+                <w:lang w:val="en-IL"/>
+              </w:rPr>
+            </w:pPr>
+            <w:r>
+              <w:rPr>
+                <w:b/>
+                <w:bCs/>
+                <w:lang w:val="en-IL"/>
+              </w:rPr>
+              <w:t>2FA обязательна</w:t>
+            </w:r>
+            <w:r>
+              <w:rPr>
+                <w:lang w:val="en-IL"/>
+              </w:rPr>
+              <w:t xml:space="preserve"> для owner. </w:t>
+            </w:r>
+          </w:p>
+          <w:p>
+            <w:pPr>
+              <w:numPr>
+                <w:ilvl w:val="0"/>
+                <w:numId w:val="77"/>
+              </w:numPr>
+              <w:rPr>
+                <w:lang w:val="en-IL"/>
+              </w:rPr>
+            </w:pPr>
+            <w:r>
+              <w:rPr>
+                <w:b/>
+                <w:bCs/>
+                <w:lang w:val="en-IL"/>
+              </w:rPr>
+              <w:t>желательно separate roles:</w:t>
+            </w:r>
+            <w:r>
+              <w:rPr>
+                <w:lang w:val="en-IL"/>
+              </w:rPr>
+              <w:t xml:space="preserve"> super owner / commercial manager / support ops (позже).</w:t>
+            </w:r>
+          </w:p>
+          <w:p>
+            <w:pPr>
+              <w:rPr>
+                <w:lang w:val="ru-RU"/>
+              </w:rPr>
+            </w:pPr>
+          </w:p>
         </w:tc>
         <w:tc>
           <w:tcPr>
@@ -4692,7 +4925,7 @@
                 <w:lang w:val="en-IL"/>
               </w:rPr>
               <w:pict w14:anchorId="63460083">
-                <v:rect id="_x0000_i2183" style="width:0;height:1.5pt" o:hralign="center" o:hrstd="t" o:hr="t" fillcolor="#a0a0a0" stroked="f"/>
+                <v:rect id="_x0000_i2842" style="width:0;height:1.5pt" o:hralign="center" o:hrstd="t" o:hr="t" fillcolor="#a0a0a0" stroked="f"/>
               </w:pict>
             </w:r>
           </w:p>
@@ -5083,7 +5316,7 @@
                 <w:lang w:val="en-IL"/>
               </w:rPr>
               <w:pict w14:anchorId="0F8E8D7D">
-                <v:rect id="_x0000_i2184" style="width:0;height:1.5pt" o:hralign="center" o:hrstd="t" o:hr="t" fillcolor="#a0a0a0" stroked="f"/>
+                <v:rect id="_x0000_i2843" style="width:0;height:1.5pt" o:hralign="center" o:hrstd="t" o:hr="t" fillcolor="#a0a0a0" stroked="f"/>
               </w:pict>
             </w:r>
           </w:p>
@@ -5506,7 +5739,7 @@
                 <w:lang w:val="en-IL"/>
               </w:rPr>
               <w:pict w14:anchorId="6AD6BD77">
-                <v:rect id="_x0000_i2185" style="width:0;height:1.5pt" o:hralign="center" o:hrstd="t" o:hr="t" fillcolor="#a0a0a0" stroked="f"/>
+                <v:rect id="_x0000_i2844" style="width:0;height:1.5pt" o:hralign="center" o:hrstd="t" o:hr="t" fillcolor="#a0a0a0" stroked="f"/>
               </w:pict>
             </w:r>
           </w:p>
@@ -5772,7 +6005,7 @@
                 <w:lang w:val="en-IL"/>
               </w:rPr>
               <w:pict w14:anchorId="4B2F5BE4">
-                <v:rect id="_x0000_i2186" style="width:0;height:1.5pt" o:hralign="center" o:hrstd="t" o:hr="t" fillcolor="#a0a0a0" stroked="f"/>
+                <v:rect id="_x0000_i2845" style="width:0;height:1.5pt" o:hralign="center" o:hrstd="t" o:hr="t" fillcolor="#a0a0a0" stroked="f"/>
               </w:pict>
             </w:r>
           </w:p>
@@ -5990,7 +6223,7 @@
                 <w:lang w:val="en-IL"/>
               </w:rPr>
               <w:pict w14:anchorId="72E515C3">
-                <v:rect id="_x0000_i2187" style="width:0;height:1.5pt" o:hralign="center" o:hrstd="t" o:hr="t" fillcolor="#a0a0a0" stroked="f"/>
+                <v:rect id="_x0000_i2846" style="width:0;height:1.5pt" o:hralign="center" o:hrstd="t" o:hr="t" fillcolor="#a0a0a0" stroked="f"/>
               </w:pict>
             </w:r>
           </w:p>
@@ -6116,7 +6349,7 @@
                 <w:lang w:val="en-IL"/>
               </w:rPr>
               <w:pict w14:anchorId="5980D52C">
-                <v:rect id="_x0000_i2188" style="width:0;height:1.5pt" o:hralign="center" o:hrstd="t" o:hr="t" fillcolor="#a0a0a0" stroked="f"/>
+                <v:rect id="_x0000_i2847" style="width:0;height:1.5pt" o:hralign="center" o:hrstd="t" o:hr="t" fillcolor="#a0a0a0" stroked="f"/>
               </w:pict>
             </w:r>
           </w:p>
@@ -6229,7 +6462,7 @@
                 <w:lang w:val="en-IL"/>
               </w:rPr>
               <w:pict w14:anchorId="3E7ED239">
-                <v:rect id="_x0000_i2189" style="width:0;height:1.5pt" o:hralign="center" o:hrstd="t" o:hr="t" fillcolor="#a0a0a0" stroked="f"/>
+                <v:rect id="_x0000_i2848" style="width:0;height:1.5pt" o:hralign="center" o:hrstd="t" o:hr="t" fillcolor="#a0a0a0" stroked="f"/>
               </w:pict>
             </w:r>
           </w:p>
@@ -6274,7 +6507,7 @@
                 <w:lang w:val="en-IL"/>
               </w:rPr>
               <w:pict w14:anchorId="2253BB5C">
-                <v:rect id="_x0000_i2190" style="width:0;height:1.5pt" o:hralign="center" o:hrstd="t" o:hr="t" fillcolor="#a0a0a0" stroked="f"/>
+                <v:rect id="_x0000_i2849" style="width:0;height:1.5pt" o:hralign="center" o:hrstd="t" o:hr="t" fillcolor="#a0a0a0" stroked="f"/>
               </w:pict>
             </w:r>
           </w:p>
@@ -6326,7 +6559,7 @@
                 <w:lang w:val="en-IL"/>
               </w:rPr>
               <w:pict w14:anchorId="01478C6C">
-                <v:rect id="_x0000_i2191" style="width:0;height:1.5pt" o:hralign="center" o:hrstd="t" o:hr="t" fillcolor="#a0a0a0" stroked="f"/>
+                <v:rect id="_x0000_i2850" style="width:0;height:1.5pt" o:hralign="center" o:hrstd="t" o:hr="t" fillcolor="#a0a0a0" stroked="f"/>
               </w:pict>
             </w:r>
           </w:p>
@@ -6814,7 +7047,7 @@
                 <w:lang w:val="en-IL"/>
               </w:rPr>
               <w:pict w14:anchorId="30E2B01A">
-                <v:rect id="_x0000_i2192" style="width:0;height:1.5pt" o:hralign="center" o:hrstd="t" o:hr="t" fillcolor="#a0a0a0" stroked="f"/>
+                <v:rect id="_x0000_i2851" style="width:0;height:1.5pt" o:hralign="center" o:hrstd="t" o:hr="t" fillcolor="#a0a0a0" stroked="f"/>
               </w:pict>
             </w:r>
           </w:p>
@@ -6944,7 +7177,7 @@
                 <w:lang w:val="en-IL"/>
               </w:rPr>
               <w:pict w14:anchorId="038A9703">
-                <v:rect id="_x0000_i2193" style="width:0;height:1.5pt" o:hralign="center" o:hrstd="t" o:hr="t" fillcolor="#a0a0a0" stroked="f"/>
+                <v:rect id="_x0000_i2852" style="width:0;height:1.5pt" o:hralign="center" o:hrstd="t" o:hr="t" fillcolor="#a0a0a0" stroked="f"/>
               </w:pict>
             </w:r>
           </w:p>
@@ -6979,7 +7212,7 @@
                 <w:lang w:val="en-IL"/>
               </w:rPr>
               <w:pict w14:anchorId="76D00A97">
-                <v:rect id="_x0000_i2194" style="width:0;height:1.5pt" o:hralign="center" o:hrstd="t" o:hr="t" fillcolor="#a0a0a0" stroked="f"/>
+                <v:rect id="_x0000_i2853" style="width:0;height:1.5pt" o:hralign="center" o:hrstd="t" o:hr="t" fillcolor="#a0a0a0" stroked="f"/>
               </w:pict>
             </w:r>
           </w:p>
@@ -7031,7 +7264,7 @@
                 <w:lang w:val="en-IL"/>
               </w:rPr>
               <w:pict w14:anchorId="263349C4">
-                <v:rect id="_x0000_i2195" style="width:0;height:1.5pt" o:hralign="center" o:hrstd="t" o:hr="t" fillcolor="#a0a0a0" stroked="f"/>
+                <v:rect id="_x0000_i2854" style="width:0;height:1.5pt" o:hralign="center" o:hrstd="t" o:hr="t" fillcolor="#a0a0a0" stroked="f"/>
               </w:pict>
             </w:r>
           </w:p>
@@ -7221,7 +7454,7 @@
                 <w:lang w:val="en-IL"/>
               </w:rPr>
               <w:pict w14:anchorId="18A1ACA9">
-                <v:rect id="_x0000_i2196" style="width:0;height:1.5pt" o:hralign="center" o:hrstd="t" o:hr="t" fillcolor="#a0a0a0" stroked="f"/>
+                <v:rect id="_x0000_i2855" style="width:0;height:1.5pt" o:hralign="center" o:hrstd="t" o:hr="t" fillcolor="#a0a0a0" stroked="f"/>
               </w:pict>
             </w:r>
           </w:p>
@@ -7334,7 +7567,7 @@
                 <w:lang w:val="en-IL"/>
               </w:rPr>
               <w:pict w14:anchorId="0D699BAD">
-                <v:rect id="_x0000_i2197" style="width:0;height:1.5pt" o:hralign="center" o:hrstd="t" o:hr="t" fillcolor="#a0a0a0" stroked="f"/>
+                <v:rect id="_x0000_i2856" style="width:0;height:1.5pt" o:hralign="center" o:hrstd="t" o:hr="t" fillcolor="#a0a0a0" stroked="f"/>
               </w:pict>
             </w:r>
           </w:p>
@@ -7369,7 +7602,7 @@
                 <w:lang w:val="en-IL"/>
               </w:rPr>
               <w:pict w14:anchorId="2785EBE1">
-                <v:rect id="_x0000_i2198" style="width:0;height:1.5pt" o:hralign="center" o:hrstd="t" o:hr="t" fillcolor="#a0a0a0" stroked="f"/>
+                <v:rect id="_x0000_i2857" style="width:0;height:1.5pt" o:hralign="center" o:hrstd="t" o:hr="t" fillcolor="#a0a0a0" stroked="f"/>
               </w:pict>
             </w:r>
           </w:p>
@@ -7545,7 +7778,7 @@
                 <w:lang w:val="en-IL"/>
               </w:rPr>
               <w:pict w14:anchorId="57B6DAC6">
-                <v:rect id="_x0000_i2199" style="width:0;height:1.5pt" o:hralign="center" o:hrstd="t" o:hr="t" fillcolor="#a0a0a0" stroked="f"/>
+                <v:rect id="_x0000_i2858" style="width:0;height:1.5pt" o:hralign="center" o:hrstd="t" o:hr="t" fillcolor="#a0a0a0" stroked="f"/>
               </w:pict>
             </w:r>
           </w:p>
@@ -7624,7 +7857,7 @@
                 <w:lang w:val="en-IL"/>
               </w:rPr>
               <w:pict w14:anchorId="1CF3B513">
-                <v:rect id="_x0000_i2200" style="width:0;height:1.5pt" o:hralign="center" o:hrstd="t" o:hr="t" fillcolor="#a0a0a0" stroked="f"/>
+                <v:rect id="_x0000_i2859" style="width:0;height:1.5pt" o:hralign="center" o:hrstd="t" o:hr="t" fillcolor="#a0a0a0" stroked="f"/>
               </w:pict>
             </w:r>
           </w:p>
@@ -7659,7 +7892,7 @@
                 <w:lang w:val="en-IL"/>
               </w:rPr>
               <w:pict w14:anchorId="4C7656E5">
-                <v:rect id="_x0000_i2201" style="width:0;height:1.5pt" o:hralign="center" o:hrstd="t" o:hr="t" fillcolor="#a0a0a0" stroked="f"/>
+                <v:rect id="_x0000_i2860" style="width:0;height:1.5pt" o:hralign="center" o:hrstd="t" o:hr="t" fillcolor="#a0a0a0" stroked="f"/>
               </w:pict>
             </w:r>
           </w:p>
@@ -7865,7 +8098,7 @@
                 <w:lang w:val="en-IL"/>
               </w:rPr>
               <w:pict w14:anchorId="72F0637C">
-                <v:rect id="_x0000_i2202" style="width:0;height:1.5pt" o:hralign="center" o:hrstd="t" o:hr="t" fillcolor="#a0a0a0" stroked="f"/>
+                <v:rect id="_x0000_i2861" style="width:0;height:1.5pt" o:hralign="center" o:hrstd="t" o:hr="t" fillcolor="#a0a0a0" stroked="f"/>
               </w:pict>
             </w:r>
           </w:p>
@@ -7900,7 +8133,7 @@
                 <w:lang w:val="en-IL"/>
               </w:rPr>
               <w:pict w14:anchorId="0B257327">
-                <v:rect id="_x0000_i2203" style="width:0;height:1.5pt" o:hralign="center" o:hrstd="t" o:hr="t" fillcolor="#a0a0a0" stroked="f"/>
+                <v:rect id="_x0000_i2862" style="width:0;height:1.5pt" o:hralign="center" o:hrstd="t" o:hr="t" fillcolor="#a0a0a0" stroked="f"/>
               </w:pict>
             </w:r>
           </w:p>
@@ -8174,7 +8407,7 @@
                 <w:lang w:val="en-IL"/>
               </w:rPr>
               <w:pict w14:anchorId="36BF503F">
-                <v:rect id="_x0000_i2204" style="width:0;height:1.5pt" o:hralign="center" o:hrstd="t" o:hr="t" fillcolor="#a0a0a0" stroked="f"/>
+                <v:rect id="_x0000_i2863" style="width:0;height:1.5pt" o:hralign="center" o:hrstd="t" o:hr="t" fillcolor="#a0a0a0" stroked="f"/>
               </w:pict>
             </w:r>
           </w:p>
@@ -8209,7 +8442,7 @@
                 <w:lang w:val="en-IL"/>
               </w:rPr>
               <w:pict w14:anchorId="647659C0">
-                <v:rect id="_x0000_i2205" style="width:0;height:1.5pt" o:hralign="center" o:hrstd="t" o:hr="t" fillcolor="#a0a0a0" stroked="f"/>
+                <v:rect id="_x0000_i2864" style="width:0;height:1.5pt" o:hralign="center" o:hrstd="t" o:hr="t" fillcolor="#a0a0a0" stroked="f"/>
               </w:pict>
             </w:r>
           </w:p>
@@ -8362,7 +8595,7 @@
                 <w:lang w:val="en-IL"/>
               </w:rPr>
               <w:pict w14:anchorId="2B5E04ED">
-                <v:rect id="_x0000_i2206" style="width:0;height:1.5pt" o:hralign="center" o:hrstd="t" o:hr="t" fillcolor="#a0a0a0" stroked="f"/>
+                <v:rect id="_x0000_i2865" style="width:0;height:1.5pt" o:hralign="center" o:hrstd="t" o:hr="t" fillcolor="#a0a0a0" stroked="f"/>
               </w:pict>
             </w:r>
           </w:p>
@@ -8461,7 +8694,7 @@
                 <w:lang w:val="en-IL"/>
               </w:rPr>
               <w:pict w14:anchorId="50EFBA55">
-                <v:rect id="_x0000_i2207" style="width:0;height:1.5pt" o:hralign="center" o:hrstd="t" o:hr="t" fillcolor="#a0a0a0" stroked="f"/>
+                <v:rect id="_x0000_i2866" style="width:0;height:1.5pt" o:hralign="center" o:hrstd="t" o:hr="t" fillcolor="#a0a0a0" stroked="f"/>
               </w:pict>
             </w:r>
           </w:p>
@@ -8496,7 +8729,7 @@
                 <w:lang w:val="en-IL"/>
               </w:rPr>
               <w:pict w14:anchorId="17CC3E9A">
-                <v:rect id="_x0000_i2208" style="width:0;height:1.5pt" o:hralign="center" o:hrstd="t" o:hr="t" fillcolor="#a0a0a0" stroked="f"/>
+                <v:rect id="_x0000_i2867" style="width:0;height:1.5pt" o:hralign="center" o:hrstd="t" o:hr="t" fillcolor="#a0a0a0" stroked="f"/>
               </w:pict>
             </w:r>
           </w:p>
@@ -8663,7 +8896,7 @@
                 <w:lang w:val="en-IL"/>
               </w:rPr>
               <w:pict w14:anchorId="118A46C1">
-                <v:rect id="_x0000_i2209" style="width:0;height:1.5pt" o:hralign="center" o:hrstd="t" o:hr="t" fillcolor="#a0a0a0" stroked="f"/>
+                <v:rect id="_x0000_i2868" style="width:0;height:1.5pt" o:hralign="center" o:hrstd="t" o:hr="t" fillcolor="#a0a0a0" stroked="f"/>
               </w:pict>
             </w:r>
           </w:p>
@@ -8698,7 +8931,7 @@
                 <w:lang w:val="en-IL"/>
               </w:rPr>
               <w:pict w14:anchorId="00C9256C">
-                <v:rect id="_x0000_i2210" style="width:0;height:1.5pt" o:hralign="center" o:hrstd="t" o:hr="t" fillcolor="#a0a0a0" stroked="f"/>
+                <v:rect id="_x0000_i2869" style="width:0;height:1.5pt" o:hralign="center" o:hrstd="t" o:hr="t" fillcolor="#a0a0a0" stroked="f"/>
               </w:pict>
             </w:r>
           </w:p>
@@ -8836,7 +9069,7 @@
                 <w:lang w:val="en-IL"/>
               </w:rPr>
               <w:pict w14:anchorId="3FAD4267">
-                <v:rect id="_x0000_i2211" style="width:0;height:1.5pt" o:hralign="center" o:hrstd="t" o:hr="t" fillcolor="#a0a0a0" stroked="f"/>
+                <v:rect id="_x0000_i2870" style="width:0;height:1.5pt" o:hralign="center" o:hrstd="t" o:hr="t" fillcolor="#a0a0a0" stroked="f"/>
               </w:pict>
             </w:r>
           </w:p>
@@ -8871,7 +9104,7 @@
                 <w:lang w:val="en-IL"/>
               </w:rPr>
               <w:pict w14:anchorId="74D93CA9">
-                <v:rect id="_x0000_i2212" style="width:0;height:1.5pt" o:hralign="center" o:hrstd="t" o:hr="t" fillcolor="#a0a0a0" stroked="f"/>
+                <v:rect id="_x0000_i2871" style="width:0;height:1.5pt" o:hralign="center" o:hrstd="t" o:hr="t" fillcolor="#a0a0a0" stroked="f"/>
               </w:pict>
             </w:r>
           </w:p>
@@ -8970,7 +9203,7 @@
                 <w:lang w:val="en-IL"/>
               </w:rPr>
               <w:pict w14:anchorId="4CF9237E">
-                <v:rect id="_x0000_i2213" style="width:0;height:1.5pt" o:hralign="center" o:hrstd="t" o:hr="t" fillcolor="#a0a0a0" stroked="f"/>
+                <v:rect id="_x0000_i2872" style="width:0;height:1.5pt" o:hralign="center" o:hrstd="t" o:hr="t" fillcolor="#a0a0a0" stroked="f"/>
               </w:pict>
             </w:r>
           </w:p>
@@ -9005,7 +9238,7 @@
                 <w:lang w:val="en-IL"/>
               </w:rPr>
               <w:pict w14:anchorId="0CD37B9B">
-                <v:rect id="_x0000_i2214" style="width:0;height:1.5pt" o:hralign="center" o:hrstd="t" o:hr="t" fillcolor="#a0a0a0" stroked="f"/>
+                <v:rect id="_x0000_i2873" style="width:0;height:1.5pt" o:hralign="center" o:hrstd="t" o:hr="t" fillcolor="#a0a0a0" stroked="f"/>
               </w:pict>
             </w:r>
           </w:p>
@@ -9270,7 +9503,7 @@
                 <w:lang w:val="en-IL"/>
               </w:rPr>
               <w:pict w14:anchorId="2839B331">
-                <v:rect id="_x0000_i2215" style="width:0;height:1.5pt" o:hralign="center" o:hrstd="t" o:hr="t" fillcolor="#a0a0a0" stroked="f"/>
+                <v:rect id="_x0000_i2874" style="width:0;height:1.5pt" o:hralign="center" o:hrstd="t" o:hr="t" fillcolor="#a0a0a0" stroked="f"/>
               </w:pict>
             </w:r>
           </w:p>
@@ -9305,7 +9538,7 @@
                 <w:lang w:val="en-IL"/>
               </w:rPr>
               <w:pict w14:anchorId="489C1606">
-                <v:rect id="_x0000_i2216" style="width:0;height:1.5pt" o:hralign="center" o:hrstd="t" o:hr="t" fillcolor="#a0a0a0" stroked="f"/>
+                <v:rect id="_x0000_i2875" style="width:0;height:1.5pt" o:hralign="center" o:hrstd="t" o:hr="t" fillcolor="#a0a0a0" stroked="f"/>
               </w:pict>
             </w:r>
           </w:p>
@@ -9431,7 +9664,7 @@
                 <w:lang w:val="en-IL"/>
               </w:rPr>
               <w:pict w14:anchorId="2705B900">
-                <v:rect id="_x0000_i2217" style="width:0;height:1.5pt" o:hralign="center" o:hrstd="t" o:hr="t" fillcolor="#a0a0a0" stroked="f"/>
+                <v:rect id="_x0000_i2876" style="width:0;height:1.5pt" o:hralign="center" o:hrstd="t" o:hr="t" fillcolor="#a0a0a0" stroked="f"/>
               </w:pict>
             </w:r>
           </w:p>
@@ -9466,7 +9699,7 @@
                 <w:lang w:val="en-IL"/>
               </w:rPr>
               <w:pict w14:anchorId="21970028">
-                <v:rect id="_x0000_i2218" style="width:0;height:1.5pt" o:hralign="center" o:hrstd="t" o:hr="t" fillcolor="#a0a0a0" stroked="f"/>
+                <v:rect id="_x0000_i2877" style="width:0;height:1.5pt" o:hralign="center" o:hrstd="t" o:hr="t" fillcolor="#a0a0a0" stroked="f"/>
               </w:pict>
             </w:r>
           </w:p>
@@ -9630,7 +9863,7 @@
                 <w:lang w:val="en-IL"/>
               </w:rPr>
               <w:pict w14:anchorId="38EDB920">
-                <v:rect id="_x0000_i2219" style="width:0;height:1.5pt" o:hralign="center" o:hrstd="t" o:hr="t" fillcolor="#a0a0a0" stroked="f"/>
+                <v:rect id="_x0000_i2878" style="width:0;height:1.5pt" o:hralign="center" o:hrstd="t" o:hr="t" fillcolor="#a0a0a0" stroked="f"/>
               </w:pict>
             </w:r>
           </w:p>
@@ -10049,7 +10282,7 @@
                 <w:lang w:val="en-IL"/>
               </w:rPr>
               <w:pict w14:anchorId="01B0B0B4">
-                <v:rect id="_x0000_i2235" style="width:0;height:1.5pt" o:hralign="center" o:hrstd="t" o:hr="t" fillcolor="#a0a0a0" stroked="f"/>
+                <v:rect id="_x0000_i2894" style="width:0;height:1.5pt" o:hralign="center" o:hrstd="t" o:hr="t" fillcolor="#a0a0a0" stroked="f"/>
               </w:pict>
             </w:r>
           </w:p>
@@ -10259,7 +10492,7 @@
                 <w:lang w:val="en-IL"/>
               </w:rPr>
               <w:pict w14:anchorId="72778902">
-                <v:rect id="_x0000_i2236" style="width:0;height:1.5pt" o:hralign="center" o:hrstd="t" o:hr="t" fillcolor="#a0a0a0" stroked="f"/>
+                <v:rect id="_x0000_i2895" style="width:0;height:1.5pt" o:hralign="center" o:hrstd="t" o:hr="t" fillcolor="#a0a0a0" stroked="f"/>
               </w:pict>
             </w:r>
           </w:p>
@@ -10482,7 +10715,7 @@
                 <w:lang w:val="en-IL"/>
               </w:rPr>
               <w:pict w14:anchorId="6ED00497">
-                <v:rect id="_x0000_i2237" style="width:0;height:1.5pt" o:hralign="center" o:hrstd="t" o:hr="t" fillcolor="#a0a0a0" stroked="f"/>
+                <v:rect id="_x0000_i2896" style="width:0;height:1.5pt" o:hralign="center" o:hrstd="t" o:hr="t" fillcolor="#a0a0a0" stroked="f"/>
               </w:pict>
             </w:r>
           </w:p>
@@ -10692,7 +10925,7 @@
                 <w:lang w:val="en-IL"/>
               </w:rPr>
               <w:pict w14:anchorId="3D4D1728">
-                <v:rect id="_x0000_i2238" style="width:0;height:1.5pt" o:hralign="center" o:hrstd="t" o:hr="t" fillcolor="#a0a0a0" stroked="f"/>
+                <v:rect id="_x0000_i2897" style="width:0;height:1.5pt" o:hralign="center" o:hrstd="t" o:hr="t" fillcolor="#a0a0a0" stroked="f"/>
               </w:pict>
             </w:r>
           </w:p>
@@ -10939,7 +11172,7 @@
                 <w:lang w:val="en-IL"/>
               </w:rPr>
               <w:pict w14:anchorId="517E2E93">
-                <v:rect id="_x0000_i2239" style="width:0;height:1.5pt" o:hralign="center" o:hrstd="t" o:hr="t" fillcolor="#a0a0a0" stroked="f"/>
+                <v:rect id="_x0000_i2898" style="width:0;height:1.5pt" o:hralign="center" o:hrstd="t" o:hr="t" fillcolor="#a0a0a0" stroked="f"/>
               </w:pict>
             </w:r>
           </w:p>
@@ -11166,7 +11399,7 @@
                 <w:lang w:val="en-IL"/>
               </w:rPr>
               <w:pict w14:anchorId="70CD9D75">
-                <v:rect id="_x0000_i2240" style="width:0;height:1.5pt" o:hralign="center" o:hrstd="t" o:hr="t" fillcolor="#a0a0a0" stroked="f"/>
+                <v:rect id="_x0000_i2899" style="width:0;height:1.5pt" o:hralign="center" o:hrstd="t" o:hr="t" fillcolor="#a0a0a0" stroked="f"/>
               </w:pict>
             </w:r>
           </w:p>
@@ -11345,7 +11578,7 @@
                 <w:lang w:val="en-IL"/>
               </w:rPr>
               <w:pict w14:anchorId="1B1E8C77">
-                <v:rect id="_x0000_i2241" style="width:0;height:1.5pt" o:hralign="center" o:hrstd="t" o:hr="t" fillcolor="#a0a0a0" stroked="f"/>
+                <v:rect id="_x0000_i2900" style="width:0;height:1.5pt" o:hralign="center" o:hrstd="t" o:hr="t" fillcolor="#a0a0a0" stroked="f"/>
               </w:pict>
             </w:r>
           </w:p>
@@ -11684,7 +11917,7 @@
                 <w:lang w:val="en-IL"/>
               </w:rPr>
               <w:pict w14:anchorId="7DFF678D">
-                <v:rect id="_x0000_i2242" style="width:0;height:1.5pt" o:hralign="center" o:hrstd="t" o:hr="t" fillcolor="#a0a0a0" stroked="f"/>
+                <v:rect id="_x0000_i2901" style="width:0;height:1.5pt" o:hralign="center" o:hrstd="t" o:hr="t" fillcolor="#a0a0a0" stroked="f"/>
               </w:pict>
             </w:r>
           </w:p>
@@ -11815,7 +12048,7 @@
                 <w:lang w:val="en-IL"/>
               </w:rPr>
               <w:pict w14:anchorId="4A348083">
-                <v:rect id="_x0000_i2243" style="width:0;height:1.5pt" o:hralign="center" o:hrstd="t" o:hr="t" fillcolor="#a0a0a0" stroked="f"/>
+                <v:rect id="_x0000_i2902" style="width:0;height:1.5pt" o:hralign="center" o:hrstd="t" o:hr="t" fillcolor="#a0a0a0" stroked="f"/>
               </w:pict>
             </w:r>
           </w:p>
@@ -11981,7 +12214,7 @@
                 <w:lang w:val="en-IL"/>
               </w:rPr>
               <w:pict w14:anchorId="5B32F7D5">
-                <v:rect id="_x0000_i2244" style="width:0;height:1.5pt" o:hralign="center" o:hrstd="t" o:hr="t" fillcolor="#a0a0a0" stroked="f"/>
+                <v:rect id="_x0000_i2903" style="width:0;height:1.5pt" o:hralign="center" o:hrstd="t" o:hr="t" fillcolor="#a0a0a0" stroked="f"/>
               </w:pict>
             </w:r>
           </w:p>
@@ -12143,7 +12376,7 @@
                 <w:lang w:val="en-IL"/>
               </w:rPr>
               <w:pict w14:anchorId="4D5A82D7">
-                <v:rect id="_x0000_i2245" style="width:0;height:1.5pt" o:hralign="center" o:hrstd="t" o:hr="t" fillcolor="#a0a0a0" stroked="f"/>
+                <v:rect id="_x0000_i2904" style="width:0;height:1.5pt" o:hralign="center" o:hrstd="t" o:hr="t" fillcolor="#a0a0a0" stroked="f"/>
               </w:pict>
             </w:r>
           </w:p>
@@ -12352,7 +12585,7 @@
           <w:p>
             <w:pPr>
               <w:rPr>
-                <w:lang w:val="ru-RU"/>
+                <w:lang w:val="en-US"/>
               </w:rPr>
             </w:pPr>
           </w:p>
@@ -12541,7 +12774,7 @@
                 <w:lang w:val="en-IL"/>
               </w:rPr>
               <w:pict w14:anchorId="766BB54B">
-                <v:rect id="_x0000_i2220" style="width:0;height:1.5pt" o:hralign="center" o:hrstd="t" o:hr="t" fillcolor="#a0a0a0" stroked="f"/>
+                <v:rect id="_x0000_i2879" style="width:0;height:1.5pt" o:hralign="center" o:hrstd="t" o:hr="t" fillcolor="#a0a0a0" stroked="f"/>
               </w:pict>
             </w:r>
           </w:p>
@@ -12695,7 +12928,7 @@
                 <w:lang w:val="en-IL"/>
               </w:rPr>
               <w:pict w14:anchorId="1D16E4AD">
-                <v:rect id="_x0000_i2221" style="width:0;height:1.5pt" o:hralign="center" o:hrstd="t" o:hr="t" fillcolor="#a0a0a0" stroked="f"/>
+                <v:rect id="_x0000_i2880" style="width:0;height:1.5pt" o:hralign="center" o:hrstd="t" o:hr="t" fillcolor="#a0a0a0" stroked="f"/>
               </w:pict>
             </w:r>
           </w:p>
@@ -12811,7 +13044,7 @@
                 <w:lang w:val="en-IL"/>
               </w:rPr>
               <w:pict w14:anchorId="124F8004">
-                <v:rect id="_x0000_i2222" style="width:0;height:1.5pt" o:hralign="center" o:hrstd="t" o:hr="t" fillcolor="#a0a0a0" stroked="f"/>
+                <v:rect id="_x0000_i2881" style="width:0;height:1.5pt" o:hralign="center" o:hrstd="t" o:hr="t" fillcolor="#a0a0a0" stroked="f"/>
               </w:pict>
             </w:r>
           </w:p>
@@ -12918,7 +13151,7 @@
                 <w:lang w:val="en-IL"/>
               </w:rPr>
               <w:pict w14:anchorId="0EEED1A7">
-                <v:rect id="_x0000_i2223" style="width:0;height:1.5pt" o:hralign="center" o:hrstd="t" o:hr="t" fillcolor="#a0a0a0" stroked="f"/>
+                <v:rect id="_x0000_i2882" style="width:0;height:1.5pt" o:hralign="center" o:hrstd="t" o:hr="t" fillcolor="#a0a0a0" stroked="f"/>
               </w:pict>
             </w:r>
           </w:p>
@@ -13051,7 +13284,7 @@
                 <w:lang w:val="en-IL"/>
               </w:rPr>
               <w:pict w14:anchorId="7AEDAFFB">
-                <v:rect id="_x0000_i2224" style="width:0;height:1.5pt" o:hralign="center" o:hrstd="t" o:hr="t" fillcolor="#a0a0a0" stroked="f"/>
+                <v:rect id="_x0000_i2883" style="width:0;height:1.5pt" o:hralign="center" o:hrstd="t" o:hr="t" fillcolor="#a0a0a0" stroked="f"/>
               </w:pict>
             </w:r>
           </w:p>
@@ -13135,7 +13368,7 @@
                 <w:lang w:val="en-IL"/>
               </w:rPr>
               <w:pict w14:anchorId="0B8538DB">
-                <v:rect id="_x0000_i2225" style="width:0;height:1.5pt" o:hralign="center" o:hrstd="t" o:hr="t" fillcolor="#a0a0a0" stroked="f"/>
+                <v:rect id="_x0000_i2884" style="width:0;height:1.5pt" o:hralign="center" o:hrstd="t" o:hr="t" fillcolor="#a0a0a0" stroked="f"/>
               </w:pict>
             </w:r>
           </w:p>
@@ -13220,7 +13453,7 @@
                 <w:lang w:val="en-IL"/>
               </w:rPr>
               <w:pict w14:anchorId="10E2E907">
-                <v:rect id="_x0000_i2226" style="width:0;height:1.5pt" o:hralign="center" o:hrstd="t" o:hr="t" fillcolor="#a0a0a0" stroked="f"/>
+                <v:rect id="_x0000_i2885" style="width:0;height:1.5pt" o:hralign="center" o:hrstd="t" o:hr="t" fillcolor="#a0a0a0" stroked="f"/>
               </w:pict>
             </w:r>
           </w:p>
@@ -13332,7 +13565,7 @@
                 <w:lang w:val="en-IL"/>
               </w:rPr>
               <w:pict w14:anchorId="6C125F3F">
-                <v:rect id="_x0000_i2227" style="width:0;height:1.5pt" o:hralign="center" o:hrstd="t" o:hr="t" fillcolor="#a0a0a0" stroked="f"/>
+                <v:rect id="_x0000_i2886" style="width:0;height:1.5pt" o:hralign="center" o:hrstd="t" o:hr="t" fillcolor="#a0a0a0" stroked="f"/>
               </w:pict>
             </w:r>
           </w:p>
@@ -13417,7 +13650,7 @@
                 <w:lang w:val="en-IL"/>
               </w:rPr>
               <w:pict w14:anchorId="17DCEC73">
-                <v:rect id="_x0000_i2228" style="width:0;height:1.5pt" o:hralign="center" o:hrstd="t" o:hr="t" fillcolor="#a0a0a0" stroked="f"/>
+                <v:rect id="_x0000_i2887" style="width:0;height:1.5pt" o:hralign="center" o:hrstd="t" o:hr="t" fillcolor="#a0a0a0" stroked="f"/>
               </w:pict>
             </w:r>
           </w:p>
@@ -13529,7 +13762,7 @@
                 <w:lang w:val="en-IL"/>
               </w:rPr>
               <w:pict w14:anchorId="1167B54C">
-                <v:rect id="_x0000_i2229" style="width:0;height:1.5pt" o:hralign="center" o:hrstd="t" o:hr="t" fillcolor="#a0a0a0" stroked="f"/>
+                <v:rect id="_x0000_i2888" style="width:0;height:1.5pt" o:hralign="center" o:hrstd="t" o:hr="t" fillcolor="#a0a0a0" stroked="f"/>
               </w:pict>
             </w:r>
           </w:p>
@@ -13645,7 +13878,7 @@
                 <w:lang w:val="en-IL"/>
               </w:rPr>
               <w:pict w14:anchorId="52A2DCF4">
-                <v:rect id="_x0000_i2230" style="width:0;height:1.5pt" o:hralign="center" o:hrstd="t" o:hr="t" fillcolor="#a0a0a0" stroked="f"/>
+                <v:rect id="_x0000_i2889" style="width:0;height:1.5pt" o:hralign="center" o:hrstd="t" o:hr="t" fillcolor="#a0a0a0" stroked="f"/>
               </w:pict>
             </w:r>
           </w:p>
@@ -13731,7 +13964,7 @@
                 <w:lang w:val="en-IL"/>
               </w:rPr>
               <w:pict w14:anchorId="4D036D42">
-                <v:rect id="_x0000_i2231" style="width:0;height:1.5pt" o:hralign="center" o:hrstd="t" o:hr="t" fillcolor="#a0a0a0" stroked="f"/>
+                <v:rect id="_x0000_i2890" style="width:0;height:1.5pt" o:hralign="center" o:hrstd="t" o:hr="t" fillcolor="#a0a0a0" stroked="f"/>
               </w:pict>
             </w:r>
           </w:p>
@@ -13845,7 +14078,7 @@
                 <w:lang w:val="en-IL"/>
               </w:rPr>
               <w:pict w14:anchorId="1783570B">
-                <v:rect id="_x0000_i2232" style="width:0;height:1.5pt" o:hralign="center" o:hrstd="t" o:hr="t" fillcolor="#a0a0a0" stroked="f"/>
+                <v:rect id="_x0000_i2891" style="width:0;height:1.5pt" o:hralign="center" o:hrstd="t" o:hr="t" fillcolor="#a0a0a0" stroked="f"/>
               </w:pict>
             </w:r>
           </w:p>
@@ -13937,7 +14170,7 @@
                 <w:lang w:val="en-IL"/>
               </w:rPr>
               <w:pict w14:anchorId="24AF0136">
-                <v:rect id="_x0000_i2233" style="width:0;height:1.5pt" o:hralign="center" o:hrstd="t" o:hr="t" fillcolor="#a0a0a0" stroked="f"/>
+                <v:rect id="_x0000_i2892" style="width:0;height:1.5pt" o:hralign="center" o:hrstd="t" o:hr="t" fillcolor="#a0a0a0" stroked="f"/>
               </w:pict>
             </w:r>
           </w:p>
@@ -14030,7 +14263,7 @@
                 <w:lang w:val="en-IL"/>
               </w:rPr>
               <w:pict w14:anchorId="68CE41A4">
-                <v:rect id="_x0000_i2234" style="width:0;height:1.5pt" o:hralign="center" o:hrstd="t" o:hr="t" fillcolor="#a0a0a0" stroked="f"/>
+                <v:rect id="_x0000_i2893" style="width:0;height:1.5pt" o:hralign="center" o:hrstd="t" o:hr="t" fillcolor="#a0a0a0" stroked="f"/>
               </w:pict>
             </w:r>
           </w:p>
@@ -24202,6 +24435,155 @@
     </w:lvl>
   </w:abstractNum>
   <w:abstractNum w:abstractNumId="68" w15:restartNumberingAfterBreak="0">
+    <w:nsid w:val="73084FA7"/>
+    <w:multiLevelType w:val="multilevel"/>
+    <w:tmpl w:val="E5741C4E"/>
+    <w:lvl w:ilvl="0">
+      <w:start w:val="1"/>
+      <w:numFmt w:val="bullet"/>
+      <w:lvlText w:val=""/>
+      <w:lvlJc w:val="left"/>
+      <w:pPr>
+        <w:tabs>
+          <w:tab w:val="num" w:pos="720"/>
+        </w:tabs>
+        <w:ind w:left="720" w:hanging="360"/>
+      </w:pPr>
+      <w:rPr>
+        <w:rFonts w:ascii="Symbol" w:hAnsi="Symbol" w:hint="default"/>
+        <w:sz w:val="20"/>
+      </w:rPr>
+    </w:lvl>
+    <w:lvl w:ilvl="1" w:tentative="1">
+      <w:start w:val="1"/>
+      <w:numFmt w:val="bullet"/>
+      <w:lvlText w:val="o"/>
+      <w:lvlJc w:val="left"/>
+      <w:pPr>
+        <w:tabs>
+          <w:tab w:val="num" w:pos="1440"/>
+        </w:tabs>
+        <w:ind w:left="1440" w:hanging="360"/>
+      </w:pPr>
+      <w:rPr>
+        <w:rFonts w:ascii="Courier New" w:hAnsi="Courier New" w:hint="default"/>
+        <w:sz w:val="20"/>
+      </w:rPr>
+    </w:lvl>
+    <w:lvl w:ilvl="2" w:tentative="1">
+      <w:start w:val="1"/>
+      <w:numFmt w:val="bullet"/>
+      <w:lvlText w:val=""/>
+      <w:lvlJc w:val="left"/>
+      <w:pPr>
+        <w:tabs>
+          <w:tab w:val="num" w:pos="2160"/>
+        </w:tabs>
+        <w:ind w:left="2160" w:hanging="360"/>
+      </w:pPr>
+      <w:rPr>
+        <w:rFonts w:ascii="Wingdings" w:hAnsi="Wingdings" w:hint="default"/>
+        <w:sz w:val="20"/>
+      </w:rPr>
+    </w:lvl>
+    <w:lvl w:ilvl="3" w:tentative="1">
+      <w:start w:val="1"/>
+      <w:numFmt w:val="bullet"/>
+      <w:lvlText w:val=""/>
+      <w:lvlJc w:val="left"/>
+      <w:pPr>
+        <w:tabs>
+          <w:tab w:val="num" w:pos="2880"/>
+        </w:tabs>
+        <w:ind w:left="2880" w:hanging="360"/>
+      </w:pPr>
+      <w:rPr>
+        <w:rFonts w:ascii="Wingdings" w:hAnsi="Wingdings" w:hint="default"/>
+        <w:sz w:val="20"/>
+      </w:rPr>
+    </w:lvl>
+    <w:lvl w:ilvl="4" w:tentative="1">
+      <w:start w:val="1"/>
+      <w:numFmt w:val="bullet"/>
+      <w:lvlText w:val=""/>
+      <w:lvlJc w:val="left"/>
+      <w:pPr>
+        <w:tabs>
+          <w:tab w:val="num" w:pos="3600"/>
+        </w:tabs>
+        <w:ind w:left="3600" w:hanging="360"/>
+      </w:pPr>
+      <w:rPr>
+        <w:rFonts w:ascii="Wingdings" w:hAnsi="Wingdings" w:hint="default"/>
+        <w:sz w:val="20"/>
+      </w:rPr>
+    </w:lvl>
+    <w:lvl w:ilvl="5" w:tentative="1">
+      <w:start w:val="1"/>
+      <w:numFmt w:val="bullet"/>
+      <w:lvlText w:val=""/>
+      <w:lvlJc w:val="left"/>
+      <w:pPr>
+        <w:tabs>
+          <w:tab w:val="num" w:pos="4320"/>
+        </w:tabs>
+        <w:ind w:left="4320" w:hanging="360"/>
+      </w:pPr>
+      <w:rPr>
+        <w:rFonts w:ascii="Wingdings" w:hAnsi="Wingdings" w:hint="default"/>
+        <w:sz w:val="20"/>
+      </w:rPr>
+    </w:lvl>
+    <w:lvl w:ilvl="6" w:tentative="1">
+      <w:start w:val="1"/>
+      <w:numFmt w:val="bullet"/>
+      <w:lvlText w:val=""/>
+      <w:lvlJc w:val="left"/>
+      <w:pPr>
+        <w:tabs>
+          <w:tab w:val="num" w:pos="5040"/>
+        </w:tabs>
+        <w:ind w:left="5040" w:hanging="360"/>
+      </w:pPr>
+      <w:rPr>
+        <w:rFonts w:ascii="Wingdings" w:hAnsi="Wingdings" w:hint="default"/>
+        <w:sz w:val="20"/>
+      </w:rPr>
+    </w:lvl>
+    <w:lvl w:ilvl="7" w:tentative="1">
+      <w:start w:val="1"/>
+      <w:numFmt w:val="bullet"/>
+      <w:lvlText w:val=""/>
+      <w:lvlJc w:val="left"/>
+      <w:pPr>
+        <w:tabs>
+          <w:tab w:val="num" w:pos="5760"/>
+        </w:tabs>
+        <w:ind w:left="5760" w:hanging="360"/>
+      </w:pPr>
+      <w:rPr>
+        <w:rFonts w:ascii="Wingdings" w:hAnsi="Wingdings" w:hint="default"/>
+        <w:sz w:val="20"/>
+      </w:rPr>
+    </w:lvl>
+    <w:lvl w:ilvl="8" w:tentative="1">
+      <w:start w:val="1"/>
+      <w:numFmt w:val="bullet"/>
+      <w:lvlText w:val=""/>
+      <w:lvlJc w:val="left"/>
+      <w:pPr>
+        <w:tabs>
+          <w:tab w:val="num" w:pos="6480"/>
+        </w:tabs>
+        <w:ind w:left="6480" w:hanging="360"/>
+      </w:pPr>
+      <w:rPr>
+        <w:rFonts w:ascii="Wingdings" w:hAnsi="Wingdings" w:hint="default"/>
+        <w:sz w:val="20"/>
+      </w:rPr>
+    </w:lvl>
+  </w:abstractNum>
+  <w:abstractNum w:abstractNumId="69" w15:restartNumberingAfterBreak="0">
     <w:nsid w:val="7386386A"/>
     <w:multiLevelType w:val="multilevel"/>
     <w:tmpl w:val="D1C63912"/>
@@ -24350,7 +24732,7 @@
       </w:rPr>
     </w:lvl>
   </w:abstractNum>
-  <w:abstractNum w:abstractNumId="69" w15:restartNumberingAfterBreak="0">
+  <w:abstractNum w:abstractNumId="70" w15:restartNumberingAfterBreak="0">
     <w:nsid w:val="743E4DD0"/>
     <w:multiLevelType w:val="multilevel"/>
     <w:tmpl w:val="E44611D0"/>
@@ -24499,7 +24881,7 @@
       </w:rPr>
     </w:lvl>
   </w:abstractNum>
-  <w:abstractNum w:abstractNumId="70" w15:restartNumberingAfterBreak="0">
+  <w:abstractNum w:abstractNumId="71" w15:restartNumberingAfterBreak="0">
     <w:nsid w:val="77A83E58"/>
     <w:multiLevelType w:val="multilevel"/>
     <w:tmpl w:val="F43C6CA8"/>
@@ -24648,7 +25030,7 @@
       </w:rPr>
     </w:lvl>
   </w:abstractNum>
-  <w:abstractNum w:abstractNumId="71" w15:restartNumberingAfterBreak="0">
+  <w:abstractNum w:abstractNumId="72" w15:restartNumberingAfterBreak="0">
     <w:nsid w:val="785521F2"/>
     <w:multiLevelType w:val="multilevel"/>
     <w:tmpl w:val="08064116"/>
@@ -24797,7 +25179,7 @@
       </w:rPr>
     </w:lvl>
   </w:abstractNum>
-  <w:abstractNum w:abstractNumId="72" w15:restartNumberingAfterBreak="0">
+  <w:abstractNum w:abstractNumId="73" w15:restartNumberingAfterBreak="0">
     <w:nsid w:val="792973FF"/>
     <w:multiLevelType w:val="multilevel"/>
     <w:tmpl w:val="9698AECC"/>
@@ -24946,7 +25328,7 @@
       </w:rPr>
     </w:lvl>
   </w:abstractNum>
-  <w:abstractNum w:abstractNumId="73" w15:restartNumberingAfterBreak="0">
+  <w:abstractNum w:abstractNumId="74" w15:restartNumberingAfterBreak="0">
     <w:nsid w:val="7B6E07F6"/>
     <w:multiLevelType w:val="multilevel"/>
     <w:tmpl w:val="2D4287C8"/>
@@ -25095,7 +25477,7 @@
       </w:rPr>
     </w:lvl>
   </w:abstractNum>
-  <w:abstractNum w:abstractNumId="74" w15:restartNumberingAfterBreak="0">
+  <w:abstractNum w:abstractNumId="75" w15:restartNumberingAfterBreak="0">
     <w:nsid w:val="7E1E0C8D"/>
     <w:multiLevelType w:val="multilevel"/>
     <w:tmpl w:val="77520FC6"/>
@@ -25244,7 +25626,7 @@
       </w:rPr>
     </w:lvl>
   </w:abstractNum>
-  <w:abstractNum w:abstractNumId="75" w15:restartNumberingAfterBreak="0">
+  <w:abstractNum w:abstractNumId="76" w15:restartNumberingAfterBreak="0">
     <w:nsid w:val="7E5C764F"/>
     <w:multiLevelType w:val="multilevel"/>
     <w:tmpl w:val="25B036B6"/>
@@ -25412,7 +25794,7 @@
     <w:abstractNumId w:val="22"/>
   </w:num>
   <w:num w:numId="7" w16cid:durableId="602684954">
-    <w:abstractNumId w:val="72"/>
+    <w:abstractNumId w:val="73"/>
   </w:num>
   <w:num w:numId="8" w16cid:durableId="1272278020">
     <w:abstractNumId w:val="28"/>
@@ -25427,7 +25809,7 @@
     <w:abstractNumId w:val="60"/>
   </w:num>
   <w:num w:numId="12" w16cid:durableId="1862425897">
-    <w:abstractNumId w:val="70"/>
+    <w:abstractNumId w:val="71"/>
   </w:num>
   <w:num w:numId="13" w16cid:durableId="1404136220">
     <w:abstractNumId w:val="29"/>
@@ -25487,7 +25869,7 @@
     <w:abstractNumId w:val="10"/>
   </w:num>
   <w:num w:numId="32" w16cid:durableId="802041360">
-    <w:abstractNumId w:val="71"/>
+    <w:abstractNumId w:val="72"/>
   </w:num>
   <w:num w:numId="33" w16cid:durableId="1939174449">
     <w:abstractNumId w:val="59"/>
@@ -25502,7 +25884,7 @@
     <w:abstractNumId w:val="46"/>
   </w:num>
   <w:num w:numId="37" w16cid:durableId="936330988">
-    <w:abstractNumId w:val="73"/>
+    <w:abstractNumId w:val="74"/>
   </w:num>
   <w:num w:numId="38" w16cid:durableId="656879309">
     <w:abstractNumId w:val="15"/>
@@ -25535,7 +25917,7 @@
     <w:abstractNumId w:val="1"/>
   </w:num>
   <w:num w:numId="48" w16cid:durableId="1504782345">
-    <w:abstractNumId w:val="69"/>
+    <w:abstractNumId w:val="70"/>
   </w:num>
   <w:num w:numId="49" w16cid:durableId="2022274590">
     <w:abstractNumId w:val="9"/>
@@ -25586,7 +25968,7 @@
     <w:abstractNumId w:val="57"/>
   </w:num>
   <w:num w:numId="65" w16cid:durableId="763840331">
-    <w:abstractNumId w:val="75"/>
+    <w:abstractNumId w:val="76"/>
   </w:num>
   <w:num w:numId="66" w16cid:durableId="2069527682">
     <w:abstractNumId w:val="34"/>
@@ -25613,13 +25995,16 @@
     <w:abstractNumId w:val="33"/>
   </w:num>
   <w:num w:numId="74" w16cid:durableId="1806661358">
-    <w:abstractNumId w:val="68"/>
+    <w:abstractNumId w:val="69"/>
   </w:num>
   <w:num w:numId="75" w16cid:durableId="1576013474">
     <w:abstractNumId w:val="63"/>
   </w:num>
   <w:num w:numId="76" w16cid:durableId="1300065095">
-    <w:abstractNumId w:val="74"/>
+    <w:abstractNumId w:val="75"/>
+  </w:num>
+  <w:num w:numId="77" w16cid:durableId="250089522">
+    <w:abstractNumId w:val="68"/>
   </w:num>
 </w:numbering>
 </file>

</xml_diff>